<commit_message>
release: clean public repo + N_e-weighted merge sensitivity (M6b/M6d) + per-gene DR FDR list
- Untrack internal editorial reports (analysis_reports/*.md), self-referential
  repo snapshot tar, and redundant analyses_logs.zip (kept locally, now gitignored)
- Add scripts/python/m6_ne_weighted_sensitivity.py: sqrt(N_e)-weighted re-merge
  of the RNH1 DR cross-cohort meta-analysis (M6b) and descriptive three-study
  merge re-including GCST90043640 (M6d); results archived in data/processed/
- Add data/processed/eqtlgen_DR_pergene_FDR.csv: per-gene eQTLGen BH-FDR values
  underlying the DR rows of Table 1 (candidate 10/24 vs non-candidate 10/24)
- Refresh tables/TableS5.csv, tables/SuppTableS5.docx and the corresponding
  block in 07_generate_supplementary_tables.py to the current k=2 meta numbers
  (+7.13, Q=76.5, I2=98.7%) plus the three sensitivity rows
- Update README structure tree and reproducibility notes accordingly
</commit_message>
<xml_diff>
--- a/tables/SuppTableS5.docx
+++ b/tables/SuppTableS5.docx
@@ -1252,7 +1252,7 @@
               <w:rPr>
                 <w:sz w:val="18"/>
               </w:rPr>
-              <w:t>FinnGen + 2 UKB</w:t>
+              <w:t>FinnGen + UKB ieu-b-4803 (k = 2)</w:t>
             </w:r>
           </w:p>
         </w:tc>
@@ -1272,7 +1272,7 @@
               <w:rPr>
                 <w:sz w:val="18"/>
               </w:rPr>
-              <w:t>+3.37</w:t>
+              <w:t>+7.13</w:t>
             </w:r>
           </w:p>
         </w:tc>
@@ -1292,7 +1292,7 @@
               <w:rPr>
                 <w:sz w:val="18"/>
               </w:rPr>
-              <w:t>7.4e-4</w:t>
+              <w:t>0.25</w:t>
             </w:r>
           </w:p>
         </w:tc>
@@ -1332,7 +1332,7 @@
               <w:rPr>
                 <w:sz w:val="18"/>
               </w:rPr>
-              <w:t>Fixed-effect meta-analysis</w:t>
+              <w:t>Random-effects pooled (unweighted mean, SE = 6.18); descriptive at k = 2</w:t>
             </w:r>
           </w:p>
         </w:tc>
@@ -1395,7 +1395,7 @@
               <w:rPr>
                 <w:sz w:val="18"/>
               </w:rPr>
-              <w:t>Cochran Q=40.0</w:t>
+              <w:t>Cochran Q = 76.5 (df = 1)</w:t>
             </w:r>
           </w:p>
         </w:tc>
@@ -1415,7 +1415,7 @@
               <w:rPr>
                 <w:sz w:val="18"/>
               </w:rPr>
-              <w:t>I²=95.0%</w:t>
+              <w:t>I² = 98.7%</w:t>
             </w:r>
           </w:p>
         </w:tc>
@@ -1435,7 +1435,7 @@
               <w:rPr>
                 <w:sz w:val="18"/>
               </w:rPr>
-              <w:t>&lt;0.0001</w:t>
+              <w:t>2.2e-18</w:t>
             </w:r>
           </w:p>
         </w:tc>
@@ -1475,7 +1475,7 @@
               <w:rPr>
                 <w:sz w:val="18"/>
               </w:rPr>
-              <w:t>Extreme heterogeneity</w:t>
+              <w:t>τ = 8.69; 95% PI [-13.77, +28.04] crosses zero</w:t>
             </w:r>
           </w:p>
         </w:tc>
@@ -1498,7 +1498,7 @@
                 <w:i/>
                 <w:sz w:val="18"/>
               </w:rPr>
-              <w:t>Prediction Interval</w:t>
+              <w:t>Sensitivity</w:t>
             </w:r>
           </w:p>
         </w:tc>
@@ -1538,7 +1538,7 @@
               <w:rPr>
                 <w:sz w:val="18"/>
               </w:rPr>
-              <w:t>95% PI</w:t>
+              <w:t>√N_e-weighted re-merge (k = 2)</w:t>
             </w:r>
           </w:p>
         </w:tc>
@@ -1558,7 +1558,27 @@
               <w:rPr>
                 <w:sz w:val="18"/>
               </w:rPr>
-              <w:t>[-4.00, +10.68]</w:t>
+              <w:t>+10.28</w:t>
+            </w:r>
+          </w:p>
+        </w:tc>
+        <w:tc>
+          <w:tcPr>
+            <w:tcW w:type="dxa" w:w="1461"/>
+            <w:tcBorders>
+              <w:left w:val="none" w:sz="0" w:space="0" w:color="000000"/>
+              <w:right w:val="none" w:sz="0" w:space="0" w:color="000000"/>
+            </w:tcBorders>
+          </w:tcPr>
+          <w:p>
+            <w:pPr>
+              <w:jc w:val="center"/>
+            </w:pPr>
+            <w:r>
+              <w:rPr>
+                <w:sz w:val="18"/>
+              </w:rPr>
+              <w:t>8.9e-25</w:t>
             </w:r>
           </w:p>
         </w:tc>
@@ -1598,7 +1618,30 @@
               <w:rPr>
                 <w:sz w:val="18"/>
               </w:rPr>
-              <w:t>Crosses zero</w:t>
+              <w:t>Weighted Stouffer, weights √(N_e,i); Q = 72.7, I² = 98.6% (m6_ne_weighted_sensitivity.py)</w:t>
+            </w:r>
+          </w:p>
+        </w:tc>
+      </w:tr>
+      <w:tr>
+        <w:tc>
+          <w:tcPr>
+            <w:tcW w:type="dxa" w:w="1461"/>
+            <w:tcBorders>
+              <w:left w:val="none" w:sz="0" w:space="0" w:color="000000"/>
+              <w:right w:val="none" w:sz="0" w:space="0" w:color="000000"/>
+            </w:tcBorders>
+          </w:tcPr>
+          <w:p>
+            <w:pPr>
+              <w:jc w:val="left"/>
+            </w:pPr>
+            <w:r>
+              <w:rPr>
+                <w:i/>
+                <w:sz w:val="18"/>
+              </w:rPr>
+              <w:t>Sensitivity</w:t>
             </w:r>
           </w:p>
         </w:tc>
@@ -1618,7 +1661,107 @@
               <w:rPr>
                 <w:sz w:val="18"/>
               </w:rPr>
-              <w:t>Unreplicable in future cohorts</w:t>
+              <w:t>DR</w:t>
+            </w:r>
+          </w:p>
+        </w:tc>
+        <w:tc>
+          <w:tcPr>
+            <w:tcW w:type="dxa" w:w="1461"/>
+            <w:tcBorders>
+              <w:left w:val="none" w:sz="0" w:space="0" w:color="000000"/>
+              <w:right w:val="none" w:sz="0" w:space="0" w:color="000000"/>
+            </w:tcBorders>
+          </w:tcPr>
+          <w:p>
+            <w:pPr>
+              <w:jc w:val="center"/>
+            </w:pPr>
+            <w:r>
+              <w:rPr>
+                <w:sz w:val="18"/>
+              </w:rPr>
+              <w:t>Three-study incl. GCST90043640 (k = 3, unweighted)</w:t>
+            </w:r>
+          </w:p>
+        </w:tc>
+        <w:tc>
+          <w:tcPr>
+            <w:tcW w:type="dxa" w:w="1461"/>
+            <w:tcBorders>
+              <w:left w:val="none" w:sz="0" w:space="0" w:color="000000"/>
+              <w:right w:val="none" w:sz="0" w:space="0" w:color="000000"/>
+            </w:tcBorders>
+          </w:tcPr>
+          <w:p>
+            <w:pPr>
+              <w:jc w:val="center"/>
+            </w:pPr>
+            <w:r>
+              <w:rPr>
+                <w:sz w:val="18"/>
+              </w:rPr>
+              <w:t>+4.95</w:t>
+            </w:r>
+          </w:p>
+        </w:tc>
+        <w:tc>
+          <w:tcPr>
+            <w:tcW w:type="dxa" w:w="1461"/>
+            <w:tcBorders>
+              <w:left w:val="none" w:sz="0" w:space="0" w:color="000000"/>
+              <w:right w:val="none" w:sz="0" w:space="0" w:color="000000"/>
+            </w:tcBorders>
+          </w:tcPr>
+          <w:p>
+            <w:pPr>
+              <w:jc w:val="center"/>
+            </w:pPr>
+            <w:r>
+              <w:rPr>
+                <w:sz w:val="18"/>
+              </w:rPr>
+              <w:t>—</w:t>
+            </w:r>
+          </w:p>
+        </w:tc>
+        <w:tc>
+          <w:tcPr>
+            <w:tcW w:type="dxa" w:w="1461"/>
+            <w:tcBorders>
+              <w:left w:val="none" w:sz="0" w:space="0" w:color="000000"/>
+              <w:right w:val="none" w:sz="0" w:space="0" w:color="000000"/>
+            </w:tcBorders>
+          </w:tcPr>
+          <w:p>
+            <w:pPr>
+              <w:jc w:val="center"/>
+            </w:pPr>
+            <w:r>
+              <w:rPr>
+                <w:sz w:val="18"/>
+              </w:rPr>
+              <w:t>—</w:t>
+            </w:r>
+          </w:p>
+        </w:tc>
+        <w:tc>
+          <w:tcPr>
+            <w:tcW w:type="dxa" w:w="1461"/>
+            <w:tcBorders>
+              <w:left w:val="none" w:sz="0" w:space="0" w:color="000000"/>
+              <w:right w:val="none" w:sz="0" w:space="0" w:color="000000"/>
+            </w:tcBorders>
+          </w:tcPr>
+          <w:p>
+            <w:pPr>
+              <w:jc w:val="center"/>
+            </w:pPr>
+            <w:r>
+              <w:rPr>
+                <w:sz w:val="18"/>
+              </w:rPr>
+              <w:t>Q = 105.2, I² = 98.1%; mixes weight sources; completeness only</w:t>
             </w:r>
           </w:p>
         </w:tc>
@@ -1630,7 +1773,149 @@
             <w:tcBorders>
               <w:left w:val="none" w:sz="0" w:space="0" w:color="000000"/>
               <w:right w:val="none" w:sz="0" w:space="0" w:color="000000"/>
-              <w:bottom w:val="single" w:sz="12" w:space="0" w:color="000000"/>
+            </w:tcBorders>
+          </w:tcPr>
+          <w:p>
+            <w:pPr>
+              <w:jc w:val="left"/>
+            </w:pPr>
+            <w:r>
+              <w:rPr>
+                <w:i/>
+                <w:sz w:val="18"/>
+              </w:rPr>
+              <w:t>Sensitivity</w:t>
+            </w:r>
+          </w:p>
+        </w:tc>
+        <w:tc>
+          <w:tcPr>
+            <w:tcW w:type="dxa" w:w="1461"/>
+            <w:tcBorders>
+              <w:left w:val="none" w:sz="0" w:space="0" w:color="000000"/>
+              <w:right w:val="none" w:sz="0" w:space="0" w:color="000000"/>
+            </w:tcBorders>
+          </w:tcPr>
+          <w:p>
+            <w:pPr>
+              <w:jc w:val="center"/>
+            </w:pPr>
+            <w:r>
+              <w:rPr>
+                <w:sz w:val="18"/>
+              </w:rPr>
+              <w:t>DR</w:t>
+            </w:r>
+          </w:p>
+        </w:tc>
+        <w:tc>
+          <w:tcPr>
+            <w:tcW w:type="dxa" w:w="1461"/>
+            <w:tcBorders>
+              <w:left w:val="none" w:sz="0" w:space="0" w:color="000000"/>
+              <w:right w:val="none" w:sz="0" w:space="0" w:color="000000"/>
+            </w:tcBorders>
+          </w:tcPr>
+          <w:p>
+            <w:pPr>
+              <w:jc w:val="center"/>
+            </w:pPr>
+            <w:r>
+              <w:rPr>
+                <w:sz w:val="18"/>
+              </w:rPr>
+              <w:t>Three-study incl. GCST90043640 (k = 3, √N_e-weighted)</w:t>
+            </w:r>
+          </w:p>
+        </w:tc>
+        <w:tc>
+          <w:tcPr>
+            <w:tcW w:type="dxa" w:w="1461"/>
+            <w:tcBorders>
+              <w:left w:val="none" w:sz="0" w:space="0" w:color="000000"/>
+              <w:right w:val="none" w:sz="0" w:space="0" w:color="000000"/>
+            </w:tcBorders>
+          </w:tcPr>
+          <w:p>
+            <w:pPr>
+              <w:jc w:val="center"/>
+            </w:pPr>
+            <w:r>
+              <w:rPr>
+                <w:sz w:val="18"/>
+              </w:rPr>
+              <w:t>+10.28</w:t>
+            </w:r>
+          </w:p>
+        </w:tc>
+        <w:tc>
+          <w:tcPr>
+            <w:tcW w:type="dxa" w:w="1461"/>
+            <w:tcBorders>
+              <w:left w:val="none" w:sz="0" w:space="0" w:color="000000"/>
+              <w:right w:val="none" w:sz="0" w:space="0" w:color="000000"/>
+            </w:tcBorders>
+          </w:tcPr>
+          <w:p>
+            <w:pPr>
+              <w:jc w:val="center"/>
+            </w:pPr>
+            <w:r>
+              <w:rPr>
+                <w:sz w:val="18"/>
+              </w:rPr>
+              <w:t>8.6e-25</w:t>
+            </w:r>
+          </w:p>
+        </w:tc>
+        <w:tc>
+          <w:tcPr>
+            <w:tcW w:type="dxa" w:w="1461"/>
+            <w:tcBorders>
+              <w:left w:val="none" w:sz="0" w:space="0" w:color="000000"/>
+              <w:right w:val="none" w:sz="0" w:space="0" w:color="000000"/>
+            </w:tcBorders>
+          </w:tcPr>
+          <w:p>
+            <w:pPr>
+              <w:jc w:val="center"/>
+            </w:pPr>
+            <w:r>
+              <w:rPr>
+                <w:sz w:val="18"/>
+              </w:rPr>
+              <w:t>—</w:t>
+            </w:r>
+          </w:p>
+        </w:tc>
+        <w:tc>
+          <w:tcPr>
+            <w:tcW w:type="dxa" w:w="1461"/>
+            <w:tcBorders>
+              <w:left w:val="none" w:sz="0" w:space="0" w:color="000000"/>
+              <w:right w:val="none" w:sz="0" w:space="0" w:color="000000"/>
+            </w:tcBorders>
+          </w:tcPr>
+          <w:p>
+            <w:pPr>
+              <w:jc w:val="center"/>
+            </w:pPr>
+            <w:r>
+              <w:rPr>
+                <w:sz w:val="18"/>
+              </w:rPr>
+              <w:t>Q = 72.9, I² = 97.3%; mixes weight sources; completeness only</w:t>
+            </w:r>
+          </w:p>
+        </w:tc>
+      </w:tr>
+      <w:tr>
+        <w:tc>
+          <w:tcPr>
+            <w:tcW w:type="dxa" w:w="1461"/>
+            <w:tcBorders>
+              <w:left w:val="none" w:sz="0" w:space="0" w:color="000000"/>
+              <w:right w:val="none" w:sz="0" w:space="0" w:color="000000"/>
             </w:tcBorders>
           </w:tcPr>
           <w:p>
@@ -1652,7 +1937,6 @@
             <w:tcBorders>
               <w:left w:val="none" w:sz="0" w:space="0" w:color="000000"/>
               <w:right w:val="none" w:sz="0" w:space="0" w:color="000000"/>
-              <w:bottom w:val="single" w:sz="12" w:space="0" w:color="000000"/>
             </w:tcBorders>
           </w:tcPr>
           <w:p>
@@ -1673,7 +1957,6 @@
             <w:tcBorders>
               <w:left w:val="none" w:sz="0" w:space="0" w:color="000000"/>
               <w:right w:val="none" w:sz="0" w:space="0" w:color="000000"/>
-              <w:bottom w:val="single" w:sz="12" w:space="0" w:color="000000"/>
             </w:tcBorders>
           </w:tcPr>
           <w:p>
@@ -1694,7 +1977,6 @@
             <w:tcBorders>
               <w:left w:val="none" w:sz="0" w:space="0" w:color="000000"/>
               <w:right w:val="none" w:sz="0" w:space="0" w:color="000000"/>
-              <w:bottom w:val="single" w:sz="12" w:space="0" w:color="000000"/>
             </w:tcBorders>
           </w:tcPr>
           <w:p>
@@ -1715,7 +1997,6 @@
             <w:tcBorders>
               <w:left w:val="none" w:sz="0" w:space="0" w:color="000000"/>
               <w:right w:val="none" w:sz="0" w:space="0" w:color="000000"/>
-              <w:bottom w:val="single" w:sz="12" w:space="0" w:color="000000"/>
             </w:tcBorders>
           </w:tcPr>
           <w:p>
@@ -1726,7 +2007,7 @@
               <w:rPr>
                 <w:sz w:val="18"/>
               </w:rPr>
-              <w:t>P=0.035</w:t>
+              <w:t>P = 0.070</w:t>
             </w:r>
           </w:p>
         </w:tc>
@@ -1736,7 +2017,6 @@
             <w:tcBorders>
               <w:left w:val="none" w:sz="0" w:space="0" w:color="000000"/>
               <w:right w:val="none" w:sz="0" w:space="0" w:color="000000"/>
-              <w:bottom w:val="single" w:sz="12" w:space="0" w:color="000000"/>
             </w:tcBorders>
           </w:tcPr>
           <w:p>
@@ -1747,7 +2027,7 @@
               <w:rPr>
                 <w:sz w:val="18"/>
               </w:rPr>
-              <w:t>Binomial test</w:t>
+              <w:t>Two-sided exact binomial</w:t>
             </w:r>
           </w:p>
         </w:tc>
@@ -1757,7 +2037,6 @@
             <w:tcBorders>
               <w:left w:val="none" w:sz="0" w:space="0" w:color="000000"/>
               <w:right w:val="none" w:sz="0" w:space="0" w:color="000000"/>
-              <w:bottom w:val="single" w:sz="12" w:space="0" w:color="000000"/>
             </w:tcBorders>
           </w:tcPr>
           <w:p>
@@ -1768,7 +2047,7 @@
               <w:rPr>
                 <w:sz w:val="18"/>
               </w:rPr>
-              <w:t>Nominal direction preservation</w:t>
+              <w:t>Group-level direction check (GTEx v8 MASHR weights, Table S5b)</w:t>
             </w:r>
           </w:p>
         </w:tc>

</xml_diff>